<commit_message>
Add canonical career data validation
</commit_message>
<xml_diff>
--- a/templates/cover-letter.template.docx
+++ b/templates/cover-letter.template.docx
@@ -5,37 +5,62 @@
     <w:p>
       <w:pPr>
         <w:spacing w:after="20"/>
+        <w:jc w:val="center"/>
+        <w:keepNext/>
+        <w:keepLines/>
       </w:pPr>
       <w:r>
         <w:rPr>
+          <w:rFonts w:ascii="Aptos Display" w:hAnsi="Aptos Display"/>
           <w:b/>
-          <w:color w:val="1F4E79"/>
-          <w:sz w:val="36"/>
+          <w:color w:val="24527A"/>
+          <w:sz w:val="40"/>
         </w:rPr>
         <w:t>{candidateName}</w:t>
       </w:r>
     </w:p>
     <w:p>
       <w:pPr>
-        <w:spacing w:after="0"/>
+        <w:spacing w:after="20"/>
+        <w:jc w:val="center"/>
+        <w:keepNext/>
+        <w:keepLines/>
       </w:pPr>
       <w:r>
+        <w:rPr>
+          <w:rFonts w:ascii="Aptos" w:hAnsi="Aptos"/>
+          <w:color w:val="52606D"/>
+          <w:sz w:val="18"/>
+        </w:rPr>
         <w:t>{location}  |  {phone}  |  {email}</w:t>
       </w:r>
     </w:p>
     <w:p>
       <w:pPr>
-        <w:spacing w:after="280"/>
+        <w:spacing w:after="20"/>
+        <w:jc w:val="center"/>
+        <w:keepNext/>
+        <w:keepLines/>
       </w:pPr>
       <w:r>
-        <w:t>{linkedin}  |  {github}</w:t>
+        <w:rPr>
+          <w:rFonts w:ascii="Aptos" w:hAnsi="Aptos"/>
+          <w:color w:val="52606D"/>
+          <w:sz w:val="18"/>
+        </w:rPr>
+        <w:t>{linkedin}  |  {github}  |  {portfolio}</w:t>
       </w:r>
     </w:p>
     <w:p>
       <w:pPr>
-        <w:spacing w:after="240"/>
+        <w:spacing w:before="240" w:after="200"/>
       </w:pPr>
       <w:r>
+        <w:rPr>
+          <w:rFonts w:ascii="Aptos" w:hAnsi="Aptos"/>
+          <w:color w:val="1F2933"/>
+          <w:sz w:val="21"/>
+        </w:rPr>
         <w:t>{date}</w:t>
       </w:r>
     </w:p>
@@ -44,6 +69,19 @@
         <w:spacing w:after="0"/>
       </w:pPr>
       <w:r>
+        <w:t>{#hasHiringManager}</w:t>
+      </w:r>
+    </w:p>
+    <w:p>
+      <w:pPr>
+        <w:spacing w:after="0"/>
+      </w:pPr>
+      <w:r>
+        <w:rPr>
+          <w:rFonts w:ascii="Aptos" w:hAnsi="Aptos"/>
+          <w:color w:val="1F2933"/>
+          <w:sz w:val="21"/>
+        </w:rPr>
         <w:t>{hiringManagerName}</w:t>
       </w:r>
     </w:p>
@@ -52,6 +90,11 @@
         <w:spacing w:after="0"/>
       </w:pPr>
       <w:r>
+        <w:rPr>
+          <w:rFonts w:ascii="Aptos" w:hAnsi="Aptos"/>
+          <w:color w:val="1F2933"/>
+          <w:sz w:val="21"/>
+        </w:rPr>
         <w:t>{hiringManagerTitle}</w:t>
       </w:r>
     </w:p>
@@ -60,6 +103,19 @@
         <w:spacing w:after="0"/>
       </w:pPr>
       <w:r>
+        <w:t>{/hasHiringManager}</w:t>
+      </w:r>
+    </w:p>
+    <w:p>
+      <w:pPr>
+        <w:spacing w:after="0"/>
+      </w:pPr>
+      <w:r>
+        <w:rPr>
+          <w:rFonts w:ascii="Aptos" w:hAnsi="Aptos"/>
+          <w:color w:val="1F2933"/>
+          <w:sz w:val="21"/>
+        </w:rPr>
         <w:t>{company}</w:t>
       </w:r>
     </w:p>
@@ -68,12 +124,43 @@
         <w:spacing w:after="0"/>
       </w:pPr>
       <w:r>
+        <w:rPr>
+          <w:rFonts w:ascii="Aptos" w:hAnsi="Aptos"/>
+          <w:color w:val="1F2933"/>
+          <w:sz w:val="21"/>
+        </w:rPr>
         <w:t>{companyLocation}</w:t>
       </w:r>
     </w:p>
-    <w:p/>
     <w:p>
+      <w:pPr>
+        <w:spacing w:before="200" w:after="200"/>
+        <w:pBdr>
+          <w:bottom w:val="single" w:sz="6" w:space="3" w:color="D9E2EC"/>
+        </w:pBdr>
+        <w:keepNext/>
+        <w:keepLines/>
+      </w:pPr>
       <w:r>
+        <w:rPr>
+          <w:rFonts w:ascii="Aptos" w:hAnsi="Aptos"/>
+          <w:b/>
+          <w:color w:val="24527A"/>
+          <w:sz w:val="21"/>
+        </w:rPr>
+        <w:t>Re: {targetRole}{jobPostingReference}</w:t>
+      </w:r>
+    </w:p>
+    <w:p>
+      <w:pPr>
+        <w:spacing w:after="160"/>
+      </w:pPr>
+      <w:r>
+        <w:rPr>
+          <w:rFonts w:ascii="Aptos" w:hAnsi="Aptos"/>
+          <w:color w:val="1F2933"/>
+          <w:sz w:val="21"/>
+        </w:rPr>
         <w:t>Dear {salutation},</w:t>
       </w:r>
     </w:p>
@@ -83,8 +170,24 @@
       </w:r>
     </w:p>
     <w:p>
+      <w:pPr>
+        <w:spacing w:after="0"/>
+      </w:pPr>
       <w:r>
-        <w:t>{evidenceParagraph}</w:t>
+        <w:t>{#evidenceParagraphs}</w:t>
+      </w:r>
+    </w:p>
+    <w:p>
+      <w:r>
+        <w:t>{text}</w:t>
+      </w:r>
+    </w:p>
+    <w:p>
+      <w:pPr>
+        <w:spacing w:after="0"/>
+      </w:pPr>
+      <w:r>
+        <w:t>{/evidenceParagraphs}</w:t>
       </w:r>
     </w:p>
     <w:p>
@@ -93,23 +196,56 @@
       </w:r>
     </w:p>
     <w:p>
+      <w:pPr>
+        <w:spacing w:after="0"/>
+      </w:pPr>
+      <w:r>
+        <w:t>{#includeAuthorization}</w:t>
+      </w:r>
+    </w:p>
+    <w:p>
+      <w:r>
+        <w:t>{authorizationParagraph}</w:t>
+      </w:r>
+    </w:p>
+    <w:p>
+      <w:pPr>
+        <w:spacing w:after="0"/>
+      </w:pPr>
+      <w:r>
+        <w:t>{/includeAuthorization}</w:t>
+      </w:r>
+    </w:p>
+    <w:p>
       <w:r>
         <w:t>{closingParagraph}</w:t>
       </w:r>
     </w:p>
     <w:p>
+      <w:pPr>
+        <w:spacing w:before="100" w:after="0"/>
+      </w:pPr>
       <w:r>
         <w:t>Sincerely,</w:t>
       </w:r>
     </w:p>
     <w:p>
+      <w:pPr>
+        <w:spacing w:after="0"/>
+      </w:pPr>
       <w:r>
+        <w:rPr>
+          <w:rFonts w:ascii="Aptos" w:hAnsi="Aptos"/>
+          <w:b/>
+          <w:color w:val="1F2933"/>
+          <w:sz w:val="21"/>
+        </w:rPr>
         <w:t>{candidateName}</w:t>
       </w:r>
     </w:p>
     <w:sectPr>
       <w:pgSz w:w="12240" w:h="15840"/>
-      <w:pgMar w:top="1008" w:right="1123" w:bottom="936" w:left="1123" w:header="720" w:footer="720" w:gutter="0"/>
+      <w:pgMar w:top="1008" w:right="1123" w:bottom="1008" w:left="1123" w:header="504" w:footer="504" w:gutter="0"/>
       <w:cols w:space="720"/>
       <w:docGrid w:linePitch="360"/>
     </w:sectPr>
@@ -481,11 +617,11 @@
     <w:qFormat/>
     <w:rsid w:val="00FC693F"/>
     <w:pPr>
-      <w:spacing w:after="140" w:line="259" w:lineRule="auto"/>
+      <w:spacing w:before="0" w:after="140" w:line="259" w:lineRule="auto"/>
     </w:pPr>
     <w:rPr>
       <w:rFonts w:ascii="Aptos" w:hAnsi="Aptos"/>
-      <w:color w:val="232323"/>
+      <w:color w:val="1F2933"/>
       <w:sz w:val="21"/>
     </w:rPr>
   </w:style>
@@ -544,15 +680,15 @@
     <w:pPr>
       <w:keepNext/>
       <w:keepLines/>
-      <w:spacing w:before="480" w:after="0"/>
+      <w:spacing w:before="180" w:after="80"/>
       <w:outlineLvl w:val="0"/>
     </w:pPr>
     <w:rPr>
-      <w:rFonts w:asciiTheme="majorHAnsi" w:eastAsiaTheme="majorEastAsia" w:hAnsiTheme="majorHAnsi" w:cstheme="majorBidi"/>
+      <w:rFonts w:asciiTheme="majorHAnsi" w:eastAsiaTheme="majorEastAsia" w:hAnsiTheme="majorHAnsi" w:cstheme="majorBidi" w:ascii="Aptos Display" w:hAnsi="Aptos Display"/>
       <w:b/>
       <w:bCs/>
-      <w:color w:val="365F91" w:themeColor="accent1" w:themeShade="BF"/>
-      <w:sz w:val="28"/>
+      <w:color w:val="24527A"/>
+      <w:sz w:val="22"/>
       <w:szCs w:val="28"/>
     </w:rPr>
   </w:style>
@@ -568,15 +704,15 @@
     <w:pPr>
       <w:keepNext/>
       <w:keepLines/>
-      <w:spacing w:before="200" w:after="0"/>
+      <w:spacing w:before="120" w:after="40"/>
       <w:outlineLvl w:val="1"/>
     </w:pPr>
     <w:rPr>
-      <w:rFonts w:asciiTheme="majorHAnsi" w:eastAsiaTheme="majorEastAsia" w:hAnsiTheme="majorHAnsi" w:cstheme="majorBidi"/>
+      <w:rFonts w:asciiTheme="majorHAnsi" w:eastAsiaTheme="majorEastAsia" w:hAnsiTheme="majorHAnsi" w:cstheme="majorBidi" w:ascii="Aptos Display" w:hAnsi="Aptos Display"/>
       <w:b/>
       <w:bCs/>
-      <w:color w:val="4F81BD" w:themeColor="accent1"/>
-      <w:sz w:val="26"/>
+      <w:color w:val="24527A"/>
+      <w:sz w:val="21"/>
       <w:szCs w:val="26"/>
     </w:rPr>
   </w:style>
@@ -592,14 +728,15 @@
     <w:pPr>
       <w:keepNext/>
       <w:keepLines/>
-      <w:spacing w:before="200" w:after="0"/>
+      <w:spacing w:before="80" w:after="40"/>
       <w:outlineLvl w:val="2"/>
     </w:pPr>
     <w:rPr>
-      <w:rFonts w:asciiTheme="majorHAnsi" w:eastAsiaTheme="majorEastAsia" w:hAnsiTheme="majorHAnsi" w:cstheme="majorBidi"/>
+      <w:rFonts w:asciiTheme="majorHAnsi" w:eastAsiaTheme="majorEastAsia" w:hAnsiTheme="majorHAnsi" w:cstheme="majorBidi" w:ascii="Aptos Display" w:hAnsi="Aptos Display"/>
       <w:b/>
       <w:bCs/>
-      <w:color w:val="4F81BD" w:themeColor="accent1"/>
+      <w:color w:val="24527A"/>
+      <w:sz w:val="20"/>
     </w:rPr>
   </w:style>
   <w:style w:type="paragraph" w:styleId="Heading4">
@@ -1015,8 +1152,14 @@
       <w:numPr>
         <w:numId w:val="1"/>
       </w:numPr>
+      <w:spacing w:after="50" w:line="259" w:lineRule="auto"/>
+      <w:ind w:left="288" w:hanging="230"/>
       <w:contextualSpacing/>
     </w:pPr>
+    <w:rPr>
+      <w:rFonts w:ascii="Aptos" w:hAnsi="Aptos"/>
+      <w:sz w:val="21"/>
+    </w:rPr>
   </w:style>
   <w:style w:type="paragraph" w:styleId="ListBullet2">
     <w:name w:val="List Bullet 2"/>

</xml_diff>